<commit_message>
Added new materials, improved UI/UX of interactive challenges
</commit_message>
<xml_diff>
--- a/public/materials/attacker-perspective/teaching-guide/cs/AttackerPerspective_Teaching_CS.docx
+++ b/public/materials/attacker-perspective/teaching-guide/cs/AttackerPerspective_Teaching_CS.docx
@@ -66,7 +66,35 @@
           <w:rFonts w:asciiTheme="majorHAnsi" w:eastAsiaTheme="majorEastAsia" w:hAnsiTheme="majorHAnsi" w:cstheme="majorBidi"/>
           <w:lang w:val="cs-CZ"/>
         </w:rPr>
-        <w:t>Ve světě, kde trávíme většinu času, obklopují naše žáky lidé, kterým můžou věřit – ti nejbližší: rodiče, členové rodiny jako sourozenci a kamarádi stejného věku. Když jdou do školy nebo se přihlásí na společné aktivity, jejich okruh lidí se rozšíří o spolužáky, učitele a asistenty pedagoga.</w:t>
+        <w:t>Ve světě, kde trávíme většinu času, obklopují naše žáky lidé, kterým můžou věřit – ti nejbližší: rodiče, členové rodiny jako sourozenci a kamarádi stejného věku. Když jdou do školy nebo se přihlásí na společné aktivity, jejich okruh lidí se rozšíří o spolužáky, učitele a </w:t>
+      </w:r>
+      <w:r>
+        <w:rPr>
+          <w:rFonts w:asciiTheme="majorHAnsi" w:eastAsiaTheme="majorEastAsia" w:hAnsiTheme="majorHAnsi" w:cstheme="majorBidi"/>
+          <w:lang w:val="cs-CZ"/>
+        </w:rPr>
+        <w:t>pedagogické</w:t>
+      </w:r>
+      <w:r>
+        <w:rPr>
+          <w:rFonts w:asciiTheme="majorHAnsi" w:eastAsiaTheme="majorEastAsia" w:hAnsiTheme="majorHAnsi" w:cstheme="majorBidi"/>
+          <w:lang w:val="cs-CZ"/>
+        </w:rPr>
+        <w:t xml:space="preserve"> </w:t>
+      </w:r>
+      <w:r>
+        <w:rPr>
+          <w:rFonts w:asciiTheme="majorHAnsi" w:eastAsiaTheme="majorEastAsia" w:hAnsiTheme="majorHAnsi" w:cstheme="majorBidi"/>
+          <w:lang w:val="cs-CZ"/>
+        </w:rPr>
+        <w:t>asistenty</w:t>
+      </w:r>
+      <w:r>
+        <w:rPr>
+          <w:rFonts w:asciiTheme="majorHAnsi" w:eastAsiaTheme="majorEastAsia" w:hAnsiTheme="majorHAnsi" w:cstheme="majorBidi"/>
+          <w:lang w:val="cs-CZ"/>
+        </w:rPr>
+        <w:t>.</w:t>
       </w:r>
     </w:p>
     <w:p>
@@ -2073,7 +2101,14 @@
           <w:rFonts w:asciiTheme="majorHAnsi" w:eastAsiaTheme="majorEastAsia" w:hAnsiTheme="majorHAnsi" w:cstheme="majorBidi"/>
           <w:lang w:val="cs-CZ"/>
         </w:rPr>
-        <w:t>určete postavu, která má nějaké negativní cíle, a pojmenujte je;</w:t>
+        <w:t>určete postavu, která má nějaké negativní cíle, a pojmenujte je</w:t>
+      </w:r>
+      <w:r>
+        <w:rPr>
+          <w:rFonts w:asciiTheme="majorHAnsi" w:eastAsiaTheme="majorEastAsia" w:hAnsiTheme="majorHAnsi" w:cstheme="majorBidi"/>
+          <w:lang w:val="cs-CZ"/>
+        </w:rPr>
+        <w:t>,</w:t>
       </w:r>
     </w:p>
     <w:p>
@@ -3858,6 +3893,7 @@
         </w:rPr>
         <w:t xml:space="preserve">Potom pomocí níže uvedených definic vysvětlete pojmy </w:t>
       </w:r>
+      <w:proofErr w:type="spellStart"/>
       <w:r>
         <w:rPr>
           <w:rFonts w:asciiTheme="majorHAnsi" w:eastAsiaTheme="majorEastAsia" w:hAnsiTheme="majorHAnsi" w:cstheme="majorBidi"/>
@@ -3867,6 +3903,7 @@
         </w:rPr>
         <w:t>smishing</w:t>
       </w:r>
+      <w:proofErr w:type="spellEnd"/>
       <w:r>
         <w:rPr>
           <w:rFonts w:asciiTheme="majorHAnsi" w:eastAsiaTheme="majorEastAsia" w:hAnsiTheme="majorHAnsi" w:cstheme="majorBidi"/>
@@ -3874,6 +3911,24 @@
         </w:rPr>
         <w:t xml:space="preserve"> a </w:t>
       </w:r>
+      <w:proofErr w:type="spellStart"/>
+      <w:r>
+        <w:rPr>
+          <w:rFonts w:asciiTheme="majorHAnsi" w:eastAsiaTheme="majorEastAsia" w:hAnsiTheme="majorHAnsi" w:cstheme="majorBidi"/>
+          <w:b/>
+          <w:bCs/>
+          <w:lang w:val="cs-CZ"/>
+        </w:rPr>
+        <w:t>impersonation</w:t>
+      </w:r>
+      <w:proofErr w:type="spellEnd"/>
+      <w:r>
+        <w:rPr>
+          <w:rFonts w:asciiTheme="majorHAnsi" w:eastAsiaTheme="majorEastAsia" w:hAnsiTheme="majorHAnsi" w:cstheme="majorBidi"/>
+          <w:lang w:val="cs-CZ"/>
+        </w:rPr>
+        <w:t xml:space="preserve"> (</w:t>
+      </w:r>
       <w:r>
         <w:rPr>
           <w:rFonts w:asciiTheme="majorHAnsi" w:eastAsiaTheme="majorEastAsia" w:hAnsiTheme="majorHAnsi" w:cstheme="majorBidi"/>
@@ -3888,8 +3943,23 @@
           <w:rFonts w:asciiTheme="majorHAnsi" w:eastAsiaTheme="majorEastAsia" w:hAnsiTheme="majorHAnsi" w:cstheme="majorBidi"/>
           <w:lang w:val="cs-CZ"/>
         </w:rPr>
-        <w:t xml:space="preserve"> (nebo </w:t>
-      </w:r>
+        <w:t>)</w:t>
+      </w:r>
+      <w:r>
+        <w:rPr>
+          <w:rFonts w:asciiTheme="majorHAnsi" w:eastAsiaTheme="majorEastAsia" w:hAnsiTheme="majorHAnsi" w:cstheme="majorBidi"/>
+          <w:lang w:val="cs-CZ"/>
+        </w:rPr>
+        <w:t xml:space="preserve">, </w:t>
+      </w:r>
+      <w:r>
+        <w:rPr>
+          <w:rFonts w:asciiTheme="majorHAnsi" w:eastAsiaTheme="majorEastAsia" w:hAnsiTheme="majorHAnsi" w:cstheme="majorBidi"/>
+          <w:lang w:val="cs-CZ"/>
+        </w:rPr>
+        <w:t xml:space="preserve">nebo </w:t>
+      </w:r>
+      <w:proofErr w:type="spellStart"/>
       <w:r>
         <w:rPr>
           <w:rFonts w:asciiTheme="majorHAnsi" w:eastAsiaTheme="majorEastAsia" w:hAnsiTheme="majorHAnsi" w:cstheme="majorBidi"/>
@@ -3899,6 +3969,7 @@
         </w:rPr>
         <w:t>vishing</w:t>
       </w:r>
+      <w:proofErr w:type="spellEnd"/>
       <w:r>
         <w:rPr>
           <w:rFonts w:asciiTheme="majorHAnsi" w:eastAsiaTheme="majorEastAsia" w:hAnsiTheme="majorHAnsi" w:cstheme="majorBidi"/>
@@ -3920,7 +3991,21 @@
           <w:rFonts w:asciiTheme="majorHAnsi" w:eastAsiaTheme="majorEastAsia" w:hAnsiTheme="majorHAnsi" w:cstheme="majorBidi"/>
           <w:lang w:val="cs-CZ"/>
         </w:rPr>
-        <w:t xml:space="preserve"> v případě druhé situace) na základě toho, čeho si žáci všimli (použijte jejich slova, vysvětlení a podrobnosti). Zdůrazněte, že smishing a vishing jsou varianty phishingu.</w:t>
+        <w:t xml:space="preserve"> v případě druhé situace</w:t>
+      </w:r>
+      <w:r>
+        <w:rPr>
+          <w:rFonts w:asciiTheme="majorHAnsi" w:eastAsiaTheme="majorEastAsia" w:hAnsiTheme="majorHAnsi" w:cstheme="majorBidi"/>
+          <w:lang w:val="cs-CZ"/>
+        </w:rPr>
+        <w:t>,</w:t>
+      </w:r>
+      <w:r>
+        <w:rPr>
+          <w:rFonts w:asciiTheme="majorHAnsi" w:eastAsiaTheme="majorEastAsia" w:hAnsiTheme="majorHAnsi" w:cstheme="majorBidi"/>
+          <w:lang w:val="cs-CZ"/>
+        </w:rPr>
+        <w:t xml:space="preserve"> na základě toho, čeho si žáci všimli (použijte jejich slova, vysvětlení a podrobnosti). Zdůrazněte, že smishing a vishing jsou varianty phishingu.</w:t>
       </w:r>
     </w:p>
     <w:p>
@@ -3933,14 +4018,57 @@
           <w:lang w:val="en-GB"/>
         </w:rPr>
       </w:pPr>
-      <w:r>
-        <w:rPr>
-          <w:rFonts w:asciiTheme="majorHAnsi" w:eastAsiaTheme="majorEastAsia" w:hAnsiTheme="majorHAnsi" w:cstheme="majorBidi"/>
-          <w:b/>
-          <w:bCs/>
-          <w:lang w:val="cs-CZ"/>
-        </w:rPr>
-        <w:t>Vydávání se za někoho</w:t>
+      <w:proofErr w:type="spellStart"/>
+      <w:r>
+        <w:rPr>
+          <w:rFonts w:asciiTheme="majorHAnsi" w:eastAsiaTheme="majorEastAsia" w:hAnsiTheme="majorHAnsi" w:cstheme="majorBidi"/>
+          <w:b/>
+          <w:bCs/>
+          <w:lang w:val="cs-CZ"/>
+        </w:rPr>
+        <w:t>Impersonation</w:t>
+      </w:r>
+      <w:proofErr w:type="spellEnd"/>
+      <w:r>
+        <w:rPr>
+          <w:rFonts w:asciiTheme="majorHAnsi" w:eastAsiaTheme="majorEastAsia" w:hAnsiTheme="majorHAnsi" w:cstheme="majorBidi"/>
+          <w:b/>
+          <w:bCs/>
+          <w:lang w:val="cs-CZ"/>
+        </w:rPr>
+        <w:t xml:space="preserve"> </w:t>
+      </w:r>
+      <w:r>
+        <w:rPr>
+          <w:rFonts w:asciiTheme="majorHAnsi" w:eastAsiaTheme="majorEastAsia" w:hAnsiTheme="majorHAnsi" w:cstheme="majorBidi"/>
+          <w:lang w:val="cs-CZ"/>
+        </w:rPr>
+        <w:t>(</w:t>
+      </w:r>
+      <w:r>
+        <w:rPr>
+          <w:rFonts w:asciiTheme="majorHAnsi" w:eastAsiaTheme="majorEastAsia" w:hAnsiTheme="majorHAnsi" w:cstheme="majorBidi"/>
+          <w:b/>
+          <w:bCs/>
+          <w:lang w:val="cs-CZ"/>
+        </w:rPr>
+        <w:t>v</w:t>
+      </w:r>
+      <w:r>
+        <w:rPr>
+          <w:rFonts w:asciiTheme="majorHAnsi" w:eastAsiaTheme="majorEastAsia" w:hAnsiTheme="majorHAnsi" w:cstheme="majorBidi"/>
+          <w:b/>
+          <w:bCs/>
+          <w:lang w:val="cs-CZ"/>
+        </w:rPr>
+        <w:t>ydávání se za někoho</w:t>
+      </w:r>
+      <w:r>
+        <w:rPr>
+          <w:rFonts w:asciiTheme="majorHAnsi" w:eastAsiaTheme="majorEastAsia" w:hAnsiTheme="majorHAnsi" w:cstheme="majorBidi"/>
+          <w:lang w:val="cs-CZ"/>
+        </w:rPr>
+        <w:t>)</w:t>
       </w:r>
       <w:r>
         <w:rPr>
@@ -8617,10 +8745,31 @@
       <w:szCs w:val="32"/>
     </w:rPr>
   </w:style>
+  <w:style w:type="paragraph" w:styleId="Heading5">
+    <w:name w:val="heading 5"/>
+    <w:basedOn w:val="Normal"/>
+    <w:next w:val="Normal"/>
+    <w:link w:val="Heading5Char"/>
+    <w:uiPriority w:val="9"/>
+    <w:semiHidden/>
+    <w:unhideWhenUsed/>
+    <w:qFormat/>
+    <w:rsid w:val="00DA308D"/>
+    <w:pPr>
+      <w:keepNext/>
+      <w:keepLines/>
+      <w:spacing w:before="40"/>
+      <w:outlineLvl w:val="4"/>
+    </w:pPr>
+    <w:rPr>
+      <w:rFonts w:asciiTheme="majorHAnsi" w:eastAsiaTheme="majorEastAsia" w:hAnsiTheme="majorHAnsi" w:cs="Mangal"/>
+      <w:color w:val="117A02" w:themeColor="accent1" w:themeShade="BF"/>
+      <w:szCs w:val="21"/>
+    </w:rPr>
+  </w:style>
   <w:style w:type="character" w:default="1" w:styleId="DefaultParagraphFont">
     <w:name w:val="Default Paragraph Font"/>
     <w:uiPriority w:val="1"/>
-    <w:semiHidden/>
     <w:unhideWhenUsed/>
   </w:style>
   <w:style w:type="table" w:default="1" w:styleId="TableNormal">
@@ -8764,6 +8913,19 @@
       </w:tabs>
     </w:pPr>
   </w:style>
+  <w:style w:type="character" w:customStyle="1" w:styleId="Heading5Char">
+    <w:name w:val="Heading 5 Char"/>
+    <w:basedOn w:val="DefaultParagraphFont"/>
+    <w:link w:val="Heading5"/>
+    <w:uiPriority w:val="9"/>
+    <w:semiHidden/>
+    <w:rsid w:val="00DA308D"/>
+    <w:rPr>
+      <w:rFonts w:asciiTheme="majorHAnsi" w:eastAsiaTheme="majorEastAsia" w:hAnsiTheme="majorHAnsi" w:cs="Mangal"/>
+      <w:color w:val="117A02" w:themeColor="accent1" w:themeShade="BF"/>
+      <w:szCs w:val="21"/>
+    </w:rPr>
+  </w:style>
 </w:styles>
 </file>
 

</xml_diff>